<commit_message>
Align founder, instructor and media information across website and capability statement
Add existing CSN onboarding and Apple Developer details to biography and training pages. Replace legacy Cyber King pages with current DivineGuard content and supplied customer review links. Standardize Access Granted URL and replace internal instructor-rate discussion with customer-facing quote information.
</commit_message>
<xml_diff>
--- a/capability-statement.docx
+++ b/capability-statement.docx
@@ -277,7 +277,7 @@
               </w:rPr>
               <w:t>Aaron Frazier Jr.</w:t>
               <w:br/>
-              <w:t>Founder, CEO &amp; CTO</w:t>
+              <w:t>Founder &amp; Principal Software Engineer</w:t>
               <w:br/>
               <w:t>725-324-8779</w:t>
               <w:br/>
@@ -661,7 +661,7 @@
                 <w:color w:val="000000"/>
                 <w:sz w:val="18"/>
               </w:rPr>
-              <w:t>IT workforce training pathways proposed for City of Las Vegas, College of Southern Nevada (CSN), and Westside Education and Training Center initiatives. Sonia Mendez has invited Aaron to discuss the curriculum, next steps and IT instructor position details; Aaron confirmed October 27. Proposed initial focus: IT fundamentals and CompTIA A+ preparation, with networking, cybersecurity, cloud, coding and professional skills considered as the program develops. Role, curriculum, staffing and start date remain subject to program approval.</w:t>
+              <w:t>Aaron Frazier Jr. is an incoming College of Southern Nevada (CSN) IT instructor, with onboarding in progress. Workforce training pathways include proposed City of Las Vegas, CSN and Westside Education and Training Center initiatives. Proposed initial focus: IT fundamentals and CompTIA A+ preparation, with networking, cybersecurity, cloud, coding and professional skills considered as the program develops. Teaching assignments, curriculum, staffing and start date remain subject to program approval. Aaron participates in the Apple Developer ecosystem; this does not imply Apple employment or endorsement. Proposed AI training and automation collaboration with AiU Agency remains subject to written agreement.</w:t>
             </w:r>
           </w:p>
           <w:p>

</xml_diff>